<commit_message>
docs: align tutorial labels and update guidance
</commit_message>
<xml_diff>
--- a/docs/DingTalkDownloader_UserGuide_zh-CN.docx
+++ b/docs/DingTalkDownloader_UserGuide_zh-CN.docx
@@ -925,7 +925,7 @@
           <w:color w:val="2F75B5"/>
           <w:sz w:val="25"/>
         </w:rPr>
-        <w:t>批量步骤 2：在下载器中点击“获取当前群回放链接”，等待采集完成。</w:t>
+        <w:t>批量步骤 2：在下载器中点击“一键获取已打开群回放”，等待采集完成。</w:t>
       </w:r>
     </w:p>
     <w:p>
@@ -942,7 +942,7 @@
           <wp:inline distT="0" distB="0" distL="0" distR="0" wp14:anchorId="4A9F7F1A" wp14:editId="77532EFC">
             <wp:extent cx="4754880" cy="2381447"/>
             <wp:effectExtent l="0" t="0" r="2540" b="6350"/>
-            <wp:docPr id="7" name="图片 7" descr="批量下载：点击获取当前群回放链接" title="批量下载：点击获取当前群回放链接"/>
+            <wp:docPr id="7" name="图片 7" descr="批量下载：点击一键获取已打开群回放" title="批量下载：点击一键获取已打开群回放"/>
             <wp:cNvGraphicFramePr>
               <a:graphicFrameLocks xmlns:a="http://schemas.openxmlformats.org/drawingml/2006/main" noChangeAspect="1"/>
             </wp:cNvGraphicFramePr>
@@ -988,7 +988,7 @@
           <w:color w:val="6B7280"/>
           <w:sz w:val="18"/>
         </w:rPr>
-        <w:t>批量图 2：点击一键获取当前群回放链接</w:t>
+        <w:t>批量图 2：点击一键获取已打开群回放</w:t>
       </w:r>
     </w:p>
     <w:p>

</xml_diff>